<commit_message>
Remove jury members from reports, metadata, and final compiled assets
</commit_message>
<xml_diff>
--- a/PresentationMaterials/MUS442_Final_Report.docx
+++ b/PresentationMaterials/MUS442_Final_Report.docx
@@ -284,56 +284,6 @@
                 <w:sz w:val="21"/>
               </w:rPr>
               <w:t>Tolga Tüzün</w:t>
-            </w:r>
-          </w:p>
-        </w:tc>
-      </w:tr>
-      <w:tr>
-        <w:tc>
-          <w:tcPr>
-            <w:tcW w:type="dxa" w:w="2880"/>
-            <w:tcMar>
-              <w:top w:w="60" w:type="dxa"/>
-              <w:bottom w:w="60" w:type="dxa"/>
-              <w:left w:w="0" w:type="dxa"/>
-              <w:right w:w="0" w:type="dxa"/>
-            </w:tcMar>
-          </w:tcPr>
-          <w:p>
-            <w:pPr>
-              <w:spacing w:after="0"/>
-            </w:pPr>
-            <w:r>
-              <w:rPr>
-                <w:rFonts w:ascii="Times New Roman" w:hAnsi="Times New Roman"/>
-                <w:b/>
-                <w:color w:val="505050"/>
-                <w:sz w:val="21"/>
-              </w:rPr>
-              <w:t>Jury Members:</w:t>
-            </w:r>
-          </w:p>
-        </w:tc>
-        <w:tc>
-          <w:tcPr>
-            <w:tcW w:type="dxa" w:w="6480"/>
-            <w:tcMar>
-              <w:top w:w="60" w:type="dxa"/>
-              <w:bottom w:w="60" w:type="dxa"/>
-              <w:left w:w="0" w:type="dxa"/>
-              <w:right w:w="0" w:type="dxa"/>
-            </w:tcMar>
-          </w:tcPr>
-          <w:p>
-            <w:pPr>
-              <w:spacing w:after="0"/>
-            </w:pPr>
-            <w:r>
-              <w:rPr>
-                <w:rFonts w:ascii="Times New Roman" w:hAnsi="Times New Roman"/>
-                <w:sz w:val="21"/>
-              </w:rPr>
-              <w:t>Tolga Tüzün, Oğuz Usman, Enis Gümüş, Yiğit Özatalay, Cem Ömeroğlu, Semin Tunalı</w:t>
             </w:r>
           </w:p>
         </w:tc>

</xml_diff>